<commit_message>
updated strata system documents
</commit_message>
<xml_diff>
--- a/docs/strata-system/stratahub.docx
+++ b/docs/strata-system/stratahub.docx
@@ -2,7 +2,7 @@
 <file path=word/document.xml><?xml version="1.0" encoding="utf-8"?>
 <w:document xmlns:w="http://schemas.openxmlformats.org/wordprocessingml/2006/main" xmlns:m="http://schemas.openxmlformats.org/officeDocument/2006/math" xmlns:r="http://schemas.openxmlformats.org/officeDocument/2006/relationships" xmlns:o="urn:schemas-microsoft-com:office:office" xmlns:v="urn:schemas-microsoft-com:vml" xmlns:w10="urn:schemas-microsoft-com:office:word" xmlns:a="http://schemas.openxmlformats.org/drawingml/2006/main" xmlns:pic="http://schemas.openxmlformats.org/drawingml/2006/picture" xmlns:wp="http://schemas.openxmlformats.org/drawingml/2006/wordprocessingDrawing">
   <w:body>
-    <w:bookmarkStart w:id="57" w:name="stratahub"/>
+    <w:bookmarkStart w:id="58" w:name="stratahub"/>
     <w:p>
       <w:pPr>
         <w:pStyle w:val="Heading1"/>
@@ -25,7 +25,7 @@
         <w:pStyle w:val="FirstParagraph"/>
       </w:pPr>
       <w:r>
-        <w:t xml:space="preserve">StrataHub is a web-based platform purpose-built to support the delivery, management, and research data collection for Mission HydroSci. It serves as the central hub through which teachers set up their classrooms, students access the game, and researchers monitor progress and collect data.</w:t>
+        <w:t xml:space="preserve">StrataHub is a web-based platform purpose-built to support the delivery, management, and research data collection for Mission HydroSci. It serves as the central hub through which teachers and administrators set up instructional groups, students access the game, and researchers monitor progress and collect data.</w:t>
       </w:r>
     </w:p>
     <w:p>
@@ -67,6 +67,14 @@
         <w:pStyle w:val="BodyText"/>
       </w:pPr>
       <w:r>
+        <w:t xml:space="preserve">While StrataHub is described here using the terminology of teachers, students, and schools for clarity, the system is built on a more general model that supports flexible organizational structures across different deployment contexts.</w:t>
+      </w:r>
+    </w:p>
+    <w:p>
+      <w:pPr>
+        <w:pStyle w:val="BodyText"/>
+      </w:pPr>
+      <w:r>
         <w:rPr>
           <w:b/>
           <w:bCs/>
@@ -77,7 +85,7 @@
         <w:t xml:space="preserve"> </w:t>
       </w:r>
       <w:r>
-        <w:t xml:space="preserve">are the top-level containers. Each workspace is an isolated environment with its own users, settings, and data. A workspace can represent a research deployment, a school district, or any other organizational boundary that requires separation. Workspaces operate on their own subdomains, ensuring complete data isolation between deployments.</w:t>
+        <w:t xml:space="preserve">are the top-level containers. Each workspace is a logically isolated environment with its own users, settings, and data, and may be deployed on a separate subdomain. A workspace can represent a research deployment, a school district, or any other organizational boundary that requires separation.</w:t>
       </w:r>
     </w:p>
     <w:p>
@@ -131,7 +139,7 @@
         <w:t xml:space="preserve"> </w:t>
       </w:r>
       <w:r>
-        <w:t xml:space="preserve">are students enrolled in one or more groups. Each member has a login identity and is associated with an organization. Their progress through Mission HydroSci, game state, and interaction data are all tied to their member identity.</w:t>
+        <w:t xml:space="preserve">are users enrolled in one or more groups, typically students. Each member has a login identity and is associated with an organization. Their progress through Mission HydroSci, game state, and interaction data are all tied to their member identity.</w:t>
       </w:r>
     </w:p>
     <w:p>
@@ -187,6 +195,24 @@
           <w:b/>
           <w:bCs/>
         </w:rPr>
+        <w:t xml:space="preserve">Analysts</w:t>
+      </w:r>
+      <w:r>
+        <w:t xml:space="preserve"> </w:t>
+      </w:r>
+      <w:r>
+        <w:t xml:space="preserve">have read-only access to aggregate data across the workspace. This role is intended for researchers who need to view system-wide metrics, such as organization counts, group counts, and member counts, without the ability to modify data or manage users.</w:t>
+      </w:r>
+    </w:p>
+    <w:p>
+      <w:pPr>
+        <w:pStyle w:val="BodyText"/>
+      </w:pPr>
+      <w:r>
+        <w:rPr>
+          <w:b/>
+          <w:bCs/>
+        </w:rPr>
         <w:t xml:space="preserve">Coordinators</w:t>
       </w:r>
       <w:r>
@@ -211,25 +237,7 @@
         <w:t xml:space="preserve"> </w:t>
       </w:r>
       <w:r>
-        <w:t xml:space="preserve">are teachers. Each leader is assigned to one or more groups (classes) and can manage the members (students) within those groups. Leaders access the Mission HydroSci Dashboard to monitor their students’ progress through the game, view detailed performance data, and identify students who may need additional support. Leaders can also distribute resources and materials to their groups, track student activity, and manage unit progression for their students.</w:t>
-      </w:r>
-    </w:p>
-    <w:p>
-      <w:pPr>
-        <w:pStyle w:val="BodyText"/>
-      </w:pPr>
-      <w:r>
-        <w:rPr>
-          <w:b/>
-          <w:bCs/>
-        </w:rPr>
-        <w:t xml:space="preserve">Analysts</w:t>
-      </w:r>
-      <w:r>
-        <w:t xml:space="preserve"> </w:t>
-      </w:r>
-      <w:r>
-        <w:t xml:space="preserve">have read-only access to aggregate data across the workspace. This role is intended for researchers who need to view system-wide metrics, such as organization counts, group counts, and member counts, without the ability to modify data or manage users.</w:t>
+        <w:t xml:space="preserve">(teachers) are assigned to one or more groups (classes) and can manage the members (students) within those groups. Leaders access the Mission HydroSci Dashboard to monitor their students’ progress through the game, view detailed performance data, and identify students who may need additional support. Leaders can also distribute resources and materials to their groups, track student activity, and manage unit progression for their students.</w:t>
       </w:r>
     </w:p>
     <w:p>
@@ -282,7 +290,7 @@
         <w:pStyle w:val="FirstParagraph"/>
       </w:pPr>
       <w:r>
-        <w:t xml:space="preserve">Students log into StrataHub using credentials appropriate to their school’s authentication setup. StrataHub supports multiple authentication methods to accommodate the variety of identity systems used across schools, including Google, Clever, ClassLink, email-based verification, and password-based login. Administrators configure which authentication methods are available for their workspace.</w:t>
+        <w:t xml:space="preserve">Students log into StrataHub using credentials appropriate to their school’s authentication setup. StrataHub supports multiple authentication methods to accommodate the variety of identity systems used across schools, including Google, Clever, ClassLink, email-based verification, and optional password-based login depending on deployment requirements. Administrators configure which authentication methods are available for their workspace.</w:t>
       </w:r>
     </w:p>
     <w:p>
@@ -473,7 +481,7 @@
         <w:pStyle w:val="BodyText"/>
       </w:pPr>
       <w:r>
-        <w:t xml:space="preserve">Mission HydroSci currently consists of five curriculum-aligned units that must be completed in order. StrataHub enforces this progression, ensuring that students advance through the units of the game as they complete each one.</w:t>
+        <w:t xml:space="preserve">Mission HydroSci currently consists of five curriculum-aligned units that must be completed in order. StrataHub enforces this sequential progression by default, with administrative overrides available for teachers and administrators to set or reset a student’s current unit when needed.</w:t>
       </w:r>
     </w:p>
     <w:bookmarkEnd w:id="22"/>
@@ -491,7 +499,7 @@
         <w:pStyle w:val="FirstParagraph"/>
       </w:pPr>
       <w:r>
-        <w:t xml:space="preserve">Mission HydroSci is delivered as a Progressive Web App (PWA). Students can install the game directly on their devices from the browser, with no app store downloads or IT department involvement required. Once installed, the PWA launches like a native application with its own icon, runs in a full-screen window without browser chrome, and loads quickly because game assets are cached locally on the device. This provides a seamless, app-like experience on Chromebooks, laptops, and desktops without the overhead of managing native app installations across a school’s device fleet.</w:t>
+        <w:t xml:space="preserve">Mission HydroSci is delivered as a Progressive Web App (PWA). Students can install the game directly on their devices from the browser, typically requiring no app store deployment or centralized IT installation. Once installed, the PWA launches like a native application with its own icon, runs in a full-screen window without browser chrome, and loads quickly because game assets are cached locally on the device. This provides a seamless, app-like experience on Chromebooks, laptops, and desktops without the overhead of managing native app installations across a school’s device fleet.</w:t>
       </w:r>
     </w:p>
     <w:bookmarkEnd w:id="23"/>
@@ -509,7 +517,7 @@
         <w:pStyle w:val="FirstParagraph"/>
       </w:pPr>
       <w:r>
-        <w:t xml:space="preserve">StrataHub tracks the status of each student’s device, including the device type, whether the PWA is installed, local storage usage, and when the device was last seen. This information is visible to teachers and administrators on the MHS Dashboard, helping them identify students who may be experiencing technical issues, such as a device running low on storage or a student who hasn’t connected in several days.</w:t>
+        <w:t xml:space="preserve">StrataHub tracks the status of each student’s device, including the device type, whether the PWA is installed, local storage usage, and when the device was last seen. Device information is limited to technical diagnostics and does not include personal or identifying device data. This information is visible to teachers and administrators on the MHS Dashboard, helping them identify students who may be experiencing technical issues, such as a device running low on storage or a student who hasn’t connected in several days.</w:t>
       </w:r>
     </w:p>
     <w:bookmarkEnd w:id="24"/>
@@ -572,6 +580,14 @@
         <w:pStyle w:val="BodyText"/>
       </w:pPr>
       <w:r>
+        <w:t xml:space="preserve">Survey data is collected through external tools and is not stored within StrataHub unless explicitly configured. StrataHub serves as the distribution mechanism, linking students to the appropriate external survey instruments.</w:t>
+      </w:r>
+    </w:p>
+    <w:p>
+      <w:pPr>
+        <w:pStyle w:val="BodyText"/>
+      </w:pPr>
+      <w:r>
         <w:t xml:space="preserve">Both Resources and Materials can be managed by administrators and, where permissions allow, by coordinators.</w:t>
       </w:r>
     </w:p>
@@ -590,7 +606,7 @@
         <w:pStyle w:val="FirstParagraph"/>
       </w:pPr>
       <w:r>
-        <w:t xml:space="preserve">The Mission HydroSci Dashboard is the primary tool for teachers and researchers to monitor student progress through the game. It provides a real-time, detailed view of every student’s status across all five units and their individual progress points.</w:t>
+        <w:t xml:space="preserve">The Mission HydroSci Dashboard is the primary tool for teachers and researchers to monitor student progress through the game. It provides a near-real-time, detailed view of every student’s status across all five units and their individual progress points. The dashboard reflects progress evaluations produced by the MHS Grader, which polls for new gameplay events on a frequent, configurable interval.</w:t>
       </w:r>
     </w:p>
     <w:bookmarkStart w:id="30" w:name="progress-grid"/>
@@ -978,7 +994,7 @@
         <w:pStyle w:val="FirstParagraph"/>
       </w:pPr>
       <w:r>
-        <w:t xml:space="preserve">The MHS Dashboard gives teachers a level of visibility into student game performance that would not be possible with the game alone. Without this dashboard, a teacher would have no way to know which students are struggling with specific content, which students haven’t played recently, or which students are ready to advance to the next unit. For researchers, the dashboard provides a real-time window into study progress across all participating classrooms, enabling early identification of implementation issues or patterns that may require attention.</w:t>
+        <w:t xml:space="preserve">The MHS Dashboard gives teachers a level of visibility into student game performance that would not be possible with the game alone. Without this dashboard, a teacher would have no way to know which students are struggling with specific content, which students haven’t played recently, or which students are ready to advance to the next unit. For researchers, the dashboard provides a near-real-time view of study progress across all participating classrooms, enabling early identification of implementation issues or patterns that may require attention.</w:t>
       </w:r>
     </w:p>
     <w:bookmarkEnd w:id="36"/>
@@ -1141,7 +1157,7 @@
         <w:pStyle w:val="FirstParagraph"/>
       </w:pPr>
       <w:r>
-        <w:t xml:space="preserve">StrataHub tracks user activity including login sessions and engagement. Leaders can view activity summaries for their students, and administrators can view activity across the workspace. This helps identify patterns such as students who are not logging in or teachers who may need additional support.</w:t>
+        <w:t xml:space="preserve">StrataHub tracks user activity including login sessions and use of StrataHub features. Leaders can view activity summaries for their students, and administrators can view activity across the workspace. This helps identify patterns such as students who are not logging in and teachers who may need additional support. Gameplay events are collected separately through StrataLog and interpreted by the MHS Grader; activity tracking within StrataHub refers only to use of StrataHub features.</w:t>
       </w:r>
     </w:p>
     <w:bookmarkEnd w:id="45"/>
@@ -1214,7 +1230,7 @@
         <w:t xml:space="preserve"> </w:t>
       </w:r>
       <w:r>
-        <w:t xml:space="preserve">and survey tools like Qualtrics or REDCap are designed for data collection and analysis, not for delivering interactive content or managing classroom hierarchies. They cannot serve a game, track in-game events, or provide teachers with real-time progress dashboards.</w:t>
+        <w:t xml:space="preserve">and survey tools like Qualtrics or REDCap are designed for data collection and analysis, not for delivering interactive content or managing classroom hierarchies. They cannot serve a game, track in-game events, or provide teachers with near-real-time progress dashboards.</w:t>
       </w:r>
     </w:p>
     <w:p>
@@ -1258,7 +1274,7 @@
         <w:pStyle w:val="FirstParagraph"/>
       </w:pPr>
       <w:r>
-        <w:t xml:space="preserve">StrataHub is designed to support the scale of a multi-site educational research project. The system architecture can reasonably support hundreds of schools, thousands of teachers, and tens of thousands of students within a single deployment.</w:t>
+        <w:t xml:space="preserve">StrataHub is designed to support the scale of a multi-site educational research project. Its architecture can scale to support hundreds of schools, thousands of teachers, and tens of thousands of students within a single deployment.</w:t>
       </w:r>
     </w:p>
     <w:p>
@@ -1266,7 +1282,7 @@
         <w:pStyle w:val="BodyText"/>
       </w:pPr>
       <w:r>
-        <w:t xml:space="preserve">The multi-workspace architecture allows separate research deployments to operate independently on isolated subdomains, each with their own organizations, users, settings, and data. This means the system can support multiple concurrent studies or deployment phases without interference between them.</w:t>
+        <w:t xml:space="preserve">The multi-workspace architecture allows separate research deployments to operate independently, each with their own organizations, users, settings, and data. This means the system can support multiple concurrent studies or deployment phases without interference between them.</w:t>
       </w:r>
     </w:p>
     <w:p>
@@ -1278,7 +1294,7 @@
       </w:r>
     </w:p>
     <w:bookmarkEnd w:id="48"/>
-    <w:bookmarkStart w:id="55" w:name="data-security-and-privacy"/>
+    <w:bookmarkStart w:id="56" w:name="data-security-and-privacy"/>
     <w:p>
       <w:pPr>
         <w:pStyle w:val="Heading2"/>
@@ -1327,7 +1343,7 @@
         <w:pStyle w:val="FirstParagraph"/>
       </w:pPr>
       <w:r>
-        <w:t xml:space="preserve">StrataHub supports multiple authentication methods to accommodate the identity systems used by participating schools. These include Google SSO, Clever, ClassLink, email-based verification, and password authentication. School-compatible SSO options allow students to log in with credentials they already use, reducing the need for separate account management and minimizing the risk of credential-related issues.</w:t>
+        <w:t xml:space="preserve">StrataHub supports multiple authentication methods to accommodate the identity systems used by participating schools. These include Google SSO, Clever, ClassLink, email-based verification, and optional password-based authentication depending on deployment requirements. School-compatible SSO options allow students to log in with credentials they already use, reducing the need for separate account management and minimizing the risk of credential-related issues.</w:t>
       </w:r>
     </w:p>
     <w:bookmarkEnd w:id="50"/>
@@ -1385,12 +1401,30 @@
       </w:r>
     </w:p>
     <w:bookmarkEnd w:id="53"/>
-    <w:bookmarkStart w:id="54" w:name="data-isolation"/>
+    <w:bookmarkStart w:id="54" w:name="inter-service-authentication"/>
     <w:p>
       <w:pPr>
         <w:pStyle w:val="Heading3"/>
       </w:pPr>
       <w:r>
+        <w:t xml:space="preserve">Inter-Service Authentication</w:t>
+      </w:r>
+    </w:p>
+    <w:p>
+      <w:pPr>
+        <w:pStyle w:val="FirstParagraph"/>
+      </w:pPr>
+      <w:r>
+        <w:t xml:space="preserve">StrataHub coordinates with companion services (StrataLog, StrataSave) that receive data directly from the game client during gameplay. When a student launches Mission HydroSci, StrataHub issues secure, session-scoped credentials. The game uses these credentials to authenticate with StrataLog and StrataSave, ensuring that only authorized game sessions can submit event data or save game state. All inter-service communication occurs over TLS-encrypted connections.</w:t>
+      </w:r>
+    </w:p>
+    <w:bookmarkEnd w:id="54"/>
+    <w:bookmarkStart w:id="55" w:name="data-isolation"/>
+    <w:p>
+      <w:pPr>
+        <w:pStyle w:val="Heading3"/>
+      </w:pPr>
+      <w:r>
         <w:t xml:space="preserve">Data Isolation</w:t>
       </w:r>
     </w:p>
@@ -1399,12 +1433,12 @@
         <w:pStyle w:val="FirstParagraph"/>
       </w:pPr>
       <w:r>
-        <w:t xml:space="preserve">The multi-workspace architecture ensures complete data isolation between separate deployments. Organizations, groups, members, and all associated data are scoped to their workspace and cannot be accessed from other workspaces. Within a workspace, role-based access control further restricts visibility to only the data each user is authorized to see.</w:t>
-      </w:r>
-    </w:p>
-    <w:bookmarkEnd w:id="54"/>
+        <w:t xml:space="preserve">The multi-workspace architecture ensures logical data isolation between separate deployments. Organizations, groups, members, and all associated data are scoped to their workspace and cannot be accessed from other workspaces. Within a workspace, role-based access control further restricts visibility to only the data each user is authorized to see.</w:t>
+      </w:r>
+    </w:p>
     <w:bookmarkEnd w:id="55"/>
-    <w:bookmarkStart w:id="56" w:name="summary-of-features"/>
+    <w:bookmarkEnd w:id="56"/>
+    <w:bookmarkStart w:id="57" w:name="summary-of-features"/>
     <w:p>
       <w:pPr>
         <w:pStyle w:val="Heading2"/>
@@ -1440,7 +1474,7 @@
         <w:t xml:space="preserve"> </w:t>
       </w:r>
       <w:r>
-        <w:t xml:space="preserve">isolated environments for independent research deployments</w:t>
+        <w:t xml:space="preserve">logically isolated environments for independent research deployments</w:t>
       </w:r>
     </w:p>
     <w:p>
@@ -1506,7 +1540,7 @@
         <w:t xml:space="preserve"> </w:t>
       </w:r>
       <w:r>
-        <w:t xml:space="preserve">Google, Clever, ClassLink, email verification, and password login to accommodate school identity systems</w:t>
+        <w:t xml:space="preserve">Google, Clever, ClassLink, email verification, and optional password-based authentication depending on deployment requirements</w:t>
       </w:r>
     </w:p>
     <w:p>
@@ -1572,7 +1606,7 @@
         <w:t xml:space="preserve"> </w:t>
       </w:r>
       <w:r>
-        <w:t xml:space="preserve">real-time progress grid showing every student’s status across all units and 26 progress points</w:t>
+        <w:t xml:space="preserve">near-real-time progress grid showing every student’s status across all units and 26 progress points</w:t>
       </w:r>
     </w:p>
     <w:p>
@@ -1814,7 +1848,7 @@
         <w:t xml:space="preserve"> </w:t>
       </w:r>
       <w:r>
-        <w:t xml:space="preserve">login session and engagement monitoring for students and teachers</w:t>
+        <w:t xml:space="preserve">login session and StrataHub feature usage monitoring for students and teachers</w:t>
       </w:r>
     </w:p>
     <w:p>
@@ -1924,7 +1958,7 @@
         <w:t xml:space="preserve"> </w:t>
       </w:r>
       <w:r>
-        <w:t xml:space="preserve">complete separation of data between workspaces and role-scoped visibility within workspaces</w:t>
+        <w:t xml:space="preserve">logical separation of data between workspaces and role-scoped visibility within workspaces</w:t>
       </w:r>
     </w:p>
     <w:p>
@@ -1949,8 +1983,8 @@
         <w:t xml:space="preserve">hosted on AWS with managed databases, scalable to hundreds of schools and tens of thousands of students</w:t>
       </w:r>
     </w:p>
-    <w:bookmarkEnd w:id="56"/>
     <w:bookmarkEnd w:id="57"/>
+    <w:bookmarkEnd w:id="58"/>
     <w:sectPr>
       <w:footnotePr>
         <w:numRestart w:val="eachSect"/>

</xml_diff>